<commit_message>
add project, timelog table
and other stuff
</commit_message>
<xml_diff>
--- a/Gábor Dénes_contract.docx
+++ b/Gábor Dénes_contract.docx
@@ -145,7 +145,7 @@
         </w:tabs>
       </w:pPr>
       <w:r>
-        <w:t>anyja neve: Jakobovits Adél</w:t>
+        <w:t>anyja neve: Tesztikula</w:t>
       </w:r>
     </w:p>
     <w:p>
@@ -156,7 +156,7 @@
         </w:tabs>
       </w:pPr>
       <w:r>
-        <w:t>lakhelye: 1119 Budapest, Fejér Lipót utca 70.</w:t>
+        <w:t>lakhelye: Asgard</w:t>
       </w:r>
     </w:p>
     <w:p>
@@ -167,7 +167,7 @@
         </w:tabs>
       </w:pPr>
       <w:r>
-        <w:t>születési hely és idő: Budapest 1900.06.05.</w:t>
+        <w:t>születési hely és idő: Budapest 1997.03.11.</w:t>
       </w:r>
     </w:p>
     <w:p>
@@ -178,7 +178,7 @@
         </w:tabs>
       </w:pPr>
       <w:r>
-        <w:t>TAJ-száma: 234-567-890</w:t>
+        <w:t>TAJ-száma: 012-345-678</w:t>
       </w:r>
     </w:p>
     <w:p>

</xml_diff>